<commit_message>
fix: refine pre-site template line spacing
</commit_message>
<xml_diff>
--- a/shared/templates/pre-site-visit/phase-ii-pre-site-visit-v4.docx
+++ b/shared/templates/pre-site-visit/phase-ii-pre-site-visit-v4.docx
@@ -77,10 +77,7 @@
       <w:proofErr w:type="spellEnd"/>
       <w:proofErr w:type="gramEnd"/>
       <w:r>
-        <w:t>]]</w:t>
-      </w:r>
-      <w:r>
-        <w:t xml:space="preserve"> - Phase II Review</w:t>
+        <w:t>]] - Phase II Review</w:t>
       </w:r>
     </w:p>
     <w:tbl>
@@ -94,20 +91,19 @@
       </w:tblPr>
       <w:tblGrid>
         <w:gridCol w:w="1800"/>
-        <w:gridCol w:w="3604"/>
-        <w:gridCol w:w="2097"/>
-        <w:gridCol w:w="2579"/>
+        <w:gridCol w:w="3508"/>
+        <w:gridCol w:w="2049"/>
+        <w:gridCol w:w="2723"/>
       </w:tblGrid>
       <w:tr>
         <w:tc>
           <w:tcPr>
             <w:tcW w:w="1000" w:type="pct"/>
-            <w:vAlign w:val="top"/>
             <w:hideMark/>
           </w:tcPr>
           <w:p>
             <w:pPr>
-              <w:spacing w:before="0" w:after="0" w:line="240" w:lineRule="auto"/>
+              <w:spacing w:after="0"/>
               <w:rPr>
                 <w:kern w:val="0"/>
                 <w14:ligatures w14:val="none"/>
@@ -126,12 +122,11 @@
           <w:tcPr>
             <w:tcW w:w="0" w:type="auto"/>
             <w:gridSpan w:val="3"/>
-            <w:vAlign w:val="top"/>
             <w:hideMark/>
           </w:tcPr>
           <w:p>
             <w:pPr>
-              <w:spacing w:before="0" w:after="0" w:line="240" w:lineRule="auto"/>
+              <w:spacing w:after="0"/>
             </w:pPr>
             <w:r>
               <w:t>[[</w:t>
@@ -157,7 +152,7 @@
           </w:tcPr>
           <w:p>
             <w:pPr>
-              <w:spacing w:before="0" w:after="0" w:line="240" w:lineRule="auto"/>
+              <w:spacing w:after="0"/>
             </w:pPr>
           </w:p>
         </w:tc>
@@ -168,7 +163,7 @@
           </w:tcPr>
           <w:p>
             <w:pPr>
-              <w:spacing w:before="0" w:after="0" w:line="240" w:lineRule="auto"/>
+              <w:spacing w:after="0"/>
             </w:pPr>
           </w:p>
         </w:tc>
@@ -179,7 +174,7 @@
           </w:tcPr>
           <w:p>
             <w:pPr>
-              <w:spacing w:before="0" w:after="0" w:line="240" w:lineRule="auto"/>
+              <w:spacing w:after="0"/>
             </w:pPr>
           </w:p>
         </w:tc>
@@ -193,7 +188,7 @@
           </w:tcPr>
           <w:p>
             <w:pPr>
-              <w:spacing w:before="0" w:after="0" w:line="240" w:lineRule="auto"/>
+              <w:spacing w:after="0"/>
             </w:pPr>
           </w:p>
         </w:tc>
@@ -207,7 +202,7 @@
           </w:tcPr>
           <w:p>
             <w:pPr>
-              <w:spacing w:before="0" w:after="0" w:line="240" w:lineRule="auto"/>
+              <w:spacing w:after="0"/>
             </w:pPr>
             <w:r>
               <w:rPr>
@@ -226,7 +221,7 @@
           </w:tcPr>
           <w:p>
             <w:pPr>
-              <w:spacing w:before="0" w:after="0" w:line="240" w:lineRule="auto"/>
+              <w:spacing w:after="0"/>
             </w:pPr>
             <w:r>
               <w:t>[[</w:t>
@@ -251,7 +246,7 @@
           </w:tcPr>
           <w:p>
             <w:pPr>
-              <w:spacing w:before="0" w:after="0" w:line="240" w:lineRule="auto"/>
+              <w:spacing w:after="0"/>
               <w:jc w:val="right"/>
             </w:pPr>
             <w:r>
@@ -274,7 +269,7 @@
           </w:tcPr>
           <w:p>
             <w:pPr>
-              <w:spacing w:before="0" w:after="0" w:line="240" w:lineRule="auto"/>
+              <w:spacing w:after="0"/>
             </w:pPr>
             <w:r>
               <w:t>[[</w:t>
@@ -301,7 +296,7 @@
           </w:tcPr>
           <w:p>
             <w:pPr>
-              <w:spacing w:before="0" w:after="0" w:line="240" w:lineRule="auto"/>
+              <w:spacing w:after="0"/>
             </w:pPr>
             <w:r>
               <w:rPr>
@@ -320,7 +315,7 @@
           </w:tcPr>
           <w:p>
             <w:pPr>
-              <w:spacing w:before="0" w:after="0" w:line="240" w:lineRule="auto"/>
+              <w:spacing w:after="0"/>
             </w:pPr>
             <w:r>
               <w:t>[[</w:t>
@@ -345,7 +340,7 @@
           </w:tcPr>
           <w:p>
             <w:pPr>
-              <w:spacing w:before="0" w:after="0" w:line="240" w:lineRule="auto"/>
+              <w:spacing w:after="0"/>
               <w:jc w:val="right"/>
             </w:pPr>
             <w:r>
@@ -368,7 +363,7 @@
           </w:tcPr>
           <w:p>
             <w:pPr>
-              <w:spacing w:before="0" w:after="0" w:line="240" w:lineRule="auto"/>
+              <w:spacing w:after="0"/>
             </w:pPr>
             <w:r>
               <w:t>[[</w:t>
@@ -396,7 +391,7 @@
           </w:tcPr>
           <w:p>
             <w:pPr>
-              <w:spacing w:before="0" w:after="0" w:line="240" w:lineRule="auto"/>
+              <w:spacing w:after="0"/>
             </w:pPr>
             <w:r>
               <w:rPr>
@@ -418,7 +413,7 @@
           </w:tcPr>
           <w:p>
             <w:pPr>
-              <w:spacing w:before="0" w:after="0" w:line="240" w:lineRule="auto"/>
+              <w:spacing w:after="0"/>
             </w:pPr>
             <w:r>
               <w:t>[[</w:t>
@@ -443,7 +438,7 @@
           </w:tcPr>
           <w:p>
             <w:pPr>
-              <w:spacing w:before="0" w:after="0" w:line="240" w:lineRule="auto"/>
+              <w:spacing w:after="0"/>
               <w:jc w:val="right"/>
             </w:pPr>
             <w:r>
@@ -466,7 +461,7 @@
           </w:tcPr>
           <w:p>
             <w:pPr>
-              <w:spacing w:before="0" w:after="0" w:line="240" w:lineRule="auto"/>
+              <w:spacing w:after="0"/>
             </w:pPr>
             <w:r>
               <w:t>[[</w:t>
@@ -487,10 +482,18 @@
     </w:tbl>
     <w:p>
       <w:pPr>
-        <w:spacing w:before="0" w:after="0" w:line="240" w:lineRule="auto"/>
         <w:pBdr>
           <w:bottom w:val="single" w:sz="12" w:space="1" w:color="auto"/>
         </w:pBdr>
+        <w:spacing w:after="0"/>
+      </w:pPr>
+    </w:p>
+    <w:p>
+      <w:pPr>
+        <w:spacing w:after="0"/>
+        <w:rPr>
+          <w:b/>
+        </w:rPr>
       </w:pPr>
     </w:p>
     <w:p>
@@ -528,6 +531,8 @@
           <w:ilvl w:val="0"/>
           <w:numId w:val="6"/>
         </w:numPr>
+        <w:spacing w:after="160"/>
+        <w:contextualSpacing w:val="0"/>
       </w:pPr>
       <w:r>
         <w:rPr>
@@ -561,6 +566,8 @@
           <w:ilvl w:val="0"/>
           <w:numId w:val="6"/>
         </w:numPr>
+        <w:spacing w:after="160"/>
+        <w:contextualSpacing w:val="0"/>
       </w:pPr>
       <w:r>
         <w:rPr>
@@ -591,6 +598,8 @@
           <w:ilvl w:val="0"/>
           <w:numId w:val="6"/>
         </w:numPr>
+        <w:spacing w:after="160"/>
+        <w:contextualSpacing w:val="0"/>
       </w:pPr>
       <w:r>
         <w:rPr>
@@ -621,6 +630,8 @@
           <w:ilvl w:val="0"/>
           <w:numId w:val="6"/>
         </w:numPr>
+        <w:spacing w:after="160"/>
+        <w:contextualSpacing w:val="0"/>
       </w:pPr>
       <w:r>
         <w:rPr>
@@ -645,7 +656,7 @@
     </w:p>
     <w:p>
       <w:pPr>
-        <w:spacing w:after="160"/>
+        <w:spacing w:afterLines="160" w:after="384"/>
       </w:pPr>
     </w:p>
     <w:p>
@@ -3569,26 +3580,6 @@
 </file>
 
 <file path=customXml/item1.xml><?xml version="1.0" encoding="utf-8"?>
-<p:properties xmlns:p="http://schemas.microsoft.com/office/2006/metadata/properties" xmlns:xsi="http://www.w3.org/2001/XMLSchema-instance" xmlns:pc="http://schemas.microsoft.com/office/infopath/2007/PartnerControls">
-  <documentManagement>
-    <lcf76f155ced4ddcb4097134ff3c332f xmlns="5c134a8e-0204-45ea-a737-5be91432ea49">
-      <Terms xmlns="http://schemas.microsoft.com/office/infopath/2007/PartnerControls"/>
-    </lcf76f155ced4ddcb4097134ff3c332f>
-    <TaxCatchAll xmlns="52370a5f-d85a-4cec-a886-ad46750aa2fb" xsi:nil="true"/>
-  </documentManagement>
-</p:properties>
-</file>
-
-<file path=customXml/item2.xml><?xml version="1.0" encoding="utf-8"?>
-<?mso-contentType ?>
-<FormTemplates xmlns="http://schemas.microsoft.com/sharepoint/v3/contenttype/forms">
-  <Display>DocumentLibraryForm</Display>
-  <Edit>DocumentLibraryForm</Edit>
-  <New>DocumentLibraryForm</New>
-</FormTemplates>
-</file>
-
-<file path=customXml/item3.xml><?xml version="1.0" encoding="utf-8"?>
 <ct:contentTypeSchema xmlns:ct="http://schemas.microsoft.com/office/2006/metadata/contentType" xmlns:ma="http://schemas.microsoft.com/office/2006/metadata/properties/metaAttributes" ct:_="" ma:_="" ma:contentTypeName="Document" ma:contentTypeID="0x010100B4754FAC7B034C40AE604D6B17AC8DCC" ma:contentTypeVersion="14" ma:contentTypeDescription="Create a new document." ma:contentTypeScope="" ma:versionID="1e90e4e4db6544c85da2519b9b9e1604">
   <xsd:schema xmlns:xsd="http://www.w3.org/2001/XMLSchema" xmlns:xs="http://www.w3.org/2001/XMLSchema" xmlns:p="http://schemas.microsoft.com/office/2006/metadata/properties" xmlns:ns2="5c134a8e-0204-45ea-a737-5be91432ea49" xmlns:ns3="52370a5f-d85a-4cec-a886-ad46750aa2fb" targetNamespace="http://schemas.microsoft.com/office/2006/metadata/properties" ma:root="true" ma:fieldsID="2ef2b877b283e7a2dbc7ff4fa4c89fd2" ns2:_="" ns3:_="">
     <xsd:import namespace="5c134a8e-0204-45ea-a737-5be91432ea49"/>
@@ -3801,26 +3792,27 @@
 </ct:contentTypeSchema>
 </file>
 
-<file path=customXml/itemProps1.xml><?xml version="1.0" encoding="utf-8"?>
-<ds:datastoreItem xmlns:ds="http://schemas.openxmlformats.org/officeDocument/2006/customXml" ds:itemID="{0DFF7817-D4BF-4C9B-8475-C01430741166}">
-  <ds:schemaRefs>
-    <ds:schemaRef ds:uri="http://schemas.microsoft.com/office/2006/metadata/properties"/>
-    <ds:schemaRef ds:uri="http://schemas.microsoft.com/office/infopath/2007/PartnerControls"/>
-    <ds:schemaRef ds:uri="5c134a8e-0204-45ea-a737-5be91432ea49"/>
-    <ds:schemaRef ds:uri="52370a5f-d85a-4cec-a886-ad46750aa2fb"/>
-  </ds:schemaRefs>
-</ds:datastoreItem>
+<file path=customXml/item2.xml><?xml version="1.0" encoding="utf-8"?>
+<?mso-contentType ?>
+<FormTemplates xmlns="http://schemas.microsoft.com/sharepoint/v3/contenttype/forms">
+  <Display>DocumentLibraryForm</Display>
+  <Edit>DocumentLibraryForm</Edit>
+  <New>DocumentLibraryForm</New>
+</FormTemplates>
 </file>
 
-<file path=customXml/itemProps2.xml><?xml version="1.0" encoding="utf-8"?>
-<ds:datastoreItem xmlns:ds="http://schemas.openxmlformats.org/officeDocument/2006/customXml" ds:itemID="{8B0AD480-D5CB-4624-863A-5147FA450CC9}">
-  <ds:schemaRefs>
-    <ds:schemaRef ds:uri="http://schemas.microsoft.com/sharepoint/v3/contenttype/forms"/>
-  </ds:schemaRefs>
-</ds:datastoreItem>
+<file path=customXml/item3.xml><?xml version="1.0" encoding="utf-8"?>
+<p:properties xmlns:p="http://schemas.microsoft.com/office/2006/metadata/properties" xmlns:xsi="http://www.w3.org/2001/XMLSchema-instance" xmlns:pc="http://schemas.microsoft.com/office/infopath/2007/PartnerControls">
+  <documentManagement>
+    <lcf76f155ced4ddcb4097134ff3c332f xmlns="5c134a8e-0204-45ea-a737-5be91432ea49">
+      <Terms xmlns="http://schemas.microsoft.com/office/infopath/2007/PartnerControls"/>
+    </lcf76f155ced4ddcb4097134ff3c332f>
+    <TaxCatchAll xmlns="52370a5f-d85a-4cec-a886-ad46750aa2fb" xsi:nil="true"/>
+  </documentManagement>
+</p:properties>
 </file>
 
-<file path=customXml/itemProps3.xml><?xml version="1.0" encoding="utf-8"?>
+<file path=customXml/itemProps1.xml><?xml version="1.0" encoding="utf-8"?>
 <ds:datastoreItem xmlns:ds="http://schemas.openxmlformats.org/officeDocument/2006/customXml" ds:itemID="{174ABFAA-E0B6-4EA5-8AD5-ECBC077AF431}">
   <ds:schemaRefs>
     <ds:schemaRef ds:uri="http://schemas.microsoft.com/office/2006/metadata/contentType"/>
@@ -3837,4 +3829,23 @@
     <ds:schemaRef ds:uri="http://schemas.microsoft.com/internal/obd"/>
   </ds:schemaRefs>
 </ds:datastoreItem>
+</file>
+
+<file path=customXml/itemProps2.xml><?xml version="1.0" encoding="utf-8"?>
+<ds:datastoreItem xmlns:ds="http://schemas.openxmlformats.org/officeDocument/2006/customXml" ds:itemID="{8B0AD480-D5CB-4624-863A-5147FA450CC9}">
+  <ds:schemaRefs>
+    <ds:schemaRef ds:uri="http://schemas.microsoft.com/sharepoint/v3/contenttype/forms"/>
+  </ds:schemaRefs>
+</ds:datastoreItem>
+</file>
+
+<file path=customXml/itemProps3.xml><?xml version="1.0" encoding="utf-8"?>
+<ds:datastoreItem xmlns:ds="http://schemas.openxmlformats.org/officeDocument/2006/customXml" ds:itemID="{0DFF7817-D4BF-4C9B-8475-C01430741166}">
+  <ds:schemaRefs>
+    <ds:schemaRef ds:uri="http://schemas.microsoft.com/office/2006/metadata/properties"/>
+    <ds:schemaRef ds:uri="http://schemas.microsoft.com/office/infopath/2007/PartnerControls"/>
+    <ds:schemaRef ds:uri="5c134a8e-0204-45ea-a737-5be91432ea49"/>
+    <ds:schemaRef ds:uri="52370a5f-d85a-4cec-a886-ad46750aa2fb"/>
+  </ds:schemaRefs>
+</ds:datastoreItem>
 </file>
</xml_diff>